<commit_message>
Correct report to justify five clean code principles from Chapters 9 to 11
</commit_message>
<xml_diff>
--- a/REPORT.docx
+++ b/REPORT.docx
@@ -86,16 +86,21 @@
       </w:r>
     </w:p>
     <w:p>
+      <w:r>
+        <w:t>Five principles from Chapters 9, 10, and 11 are applied below.</w:t>
+      </w:r>
+    </w:p>
+    <w:p>
       <w:pPr>
         <w:pStyle w:val="Heading2"/>
       </w:pPr>
       <w:r>
-        <w:t>Chapter 9 Unit Tests</w:t>
+        <w:t>Principle 1 Single concept per test</w:t>
       </w:r>
     </w:p>
     <w:p>
       <w:r>
-        <w:t>Single concept per test. Each test checks one behavior: addition, subtraction, multiplication, or runtime switching. Tests create their own calculator and have one assertion, so they do not share state or depend on execution order. A small assertion helper keeps the tests free of external libraries.</w:t>
+        <w:t>Chapter 9 Unit Tests. Each test checks one behavior: addition, subtraction, multiplication, or runtime switching. Tests create their own calculator and have one assertion, so they do not share state or depend on execution order. This makes failures easy to locate.</w:t>
       </w:r>
     </w:p>
     <w:p>
@@ -139,12 +144,12 @@
         <w:pStyle w:val="Heading2"/>
       </w:pPr>
       <w:r>
-        <w:t>Chapter 10 Classes</w:t>
+        <w:t>Principle 2 Single Responsibility Principle</w:t>
       </w:r>
     </w:p>
     <w:p>
       <w:r>
-        <w:t>Single Responsibility Principle. Strategies perform arithmetic, Calculator delegates execution, and Main configures strategies and prints the demo. Changing console output does not require changing an arithmetic class.</w:t>
+        <w:t>Chapter 10 Classes. Strategies perform arithmetic, Calculator delegates execution, and Main configures strategies and prints the demo. Each class has a focused reason to change. Changing console output does not require changing an arithmetic class.</w:t>
       </w:r>
     </w:p>
     <w:p>
@@ -188,12 +193,154 @@
         <w:pStyle w:val="Heading2"/>
       </w:pPr>
       <w:r>
-        <w:t>Chapter 11 Systems</w:t>
+        <w:t>Principle 3 Cohesion</w:t>
       </w:r>
     </w:p>
     <w:p>
       <w:r>
-        <w:t>Separate construction from use. Main constructs the concrete strategies and supplies them to Calculator. Calculator uses the interface without creating the algorithms itself. Passing a strategy through a constructor or setter is simple dependency injection and needs no framework.</w:t>
+        <w:t>Chapter 10 Classes. The constructor, setStrategy, and calculate work with the same private strategy field. The constructor initializes it through the setter, the setter updates it, and calculate uses it. These related methods belong together and support the calculator responsibility.</w:t>
+      </w:r>
+    </w:p>
+    <w:p>
+      <w:pPr>
+        <w:spacing w:after="140" w:line="240" w:lineRule="auto"/>
+      </w:pPr>
+      <w:r>
+        <w:rPr>
+          <w:rFonts w:ascii="Consolas" w:hAnsi="Consolas"/>
+          <w:sz w:val="18"/>
+        </w:rPr>
+        <w:t>private OperationStrategy strategy; // Shared state.</w:t>
+      </w:r>
+      <w:r>
+        <w:rPr>
+          <w:rFonts w:ascii="Consolas" w:hAnsi="Consolas"/>
+          <w:sz w:val="18"/>
+        </w:rPr>
+        <w:br/>
+        <w:t>public void setStrategy(OperationStrategy strategy) {</w:t>
+      </w:r>
+      <w:r>
+        <w:rPr>
+          <w:rFonts w:ascii="Consolas" w:hAnsi="Consolas"/>
+          <w:sz w:val="18"/>
+        </w:rPr>
+        <w:br/>
+        <w:t xml:space="preserve">    this.strategy = Objects.requireNonNull(strategy, "Strategy is required");</w:t>
+      </w:r>
+      <w:r>
+        <w:rPr>
+          <w:rFonts w:ascii="Consolas" w:hAnsi="Consolas"/>
+          <w:sz w:val="18"/>
+        </w:rPr>
+        <w:br/>
+        <w:t>}</w:t>
+      </w:r>
+      <w:r>
+        <w:rPr>
+          <w:rFonts w:ascii="Consolas" w:hAnsi="Consolas"/>
+          <w:sz w:val="18"/>
+        </w:rPr>
+        <w:br/>
+        <w:t>public double calculate(double firstNumber, double secondNumber) {</w:t>
+      </w:r>
+      <w:r>
+        <w:rPr>
+          <w:rFonts w:ascii="Consolas" w:hAnsi="Consolas"/>
+          <w:sz w:val="18"/>
+        </w:rPr>
+        <w:br/>
+        <w:t xml:space="preserve">    return strategy.execute(firstNumber, secondNumber); // Same field.</w:t>
+      </w:r>
+      <w:r>
+        <w:rPr>
+          <w:rFonts w:ascii="Consolas" w:hAnsi="Consolas"/>
+          <w:sz w:val="18"/>
+        </w:rPr>
+        <w:br/>
+        <w:t>}</w:t>
+      </w:r>
+    </w:p>
+    <w:p>
+      <w:r>
+        <w:br w:type="page"/>
+      </w:r>
+    </w:p>
+    <w:p>
+      <w:pPr>
+        <w:pStyle w:val="Heading1"/>
+      </w:pPr>
+      <w:r>
+        <w:t>Clean code principles continued</w:t>
+      </w:r>
+    </w:p>
+    <w:p>
+      <w:pPr>
+        <w:pStyle w:val="Heading2"/>
+      </w:pPr>
+      <w:r>
+        <w:t>Principle 4 Isolating from change</w:t>
+      </w:r>
+    </w:p>
+    <w:p>
+      <w:r>
+        <w:t>Chapter 10 Classes. Calculator depends on the OperationStrategy interface, so changing an arithmetic implementation does not require changing the context. Division can be added with a new implementation selected in Main. The existing context and strategies stay unchanged; the client still needs to configure the new operation.</w:t>
+      </w:r>
+    </w:p>
+    <w:p>
+      <w:pPr>
+        <w:spacing w:after="140" w:line="240" w:lineRule="auto"/>
+      </w:pPr>
+      <w:r>
+        <w:rPr>
+          <w:rFonts w:ascii="Consolas" w:hAnsi="Consolas"/>
+          <w:sz w:val="18"/>
+        </w:rPr>
+        <w:t>// Calculator depends on an interface, not AddStrategy or MultiplyStrategy.</w:t>
+      </w:r>
+      <w:r>
+        <w:rPr>
+          <w:rFonts w:ascii="Consolas" w:hAnsi="Consolas"/>
+          <w:sz w:val="18"/>
+        </w:rPr>
+        <w:br/>
+        <w:t>private OperationStrategy strategy;</w:t>
+      </w:r>
+      <w:r>
+        <w:rPr>
+          <w:rFonts w:ascii="Consolas" w:hAnsi="Consolas"/>
+          <w:sz w:val="18"/>
+        </w:rPr>
+        <w:br/>
+      </w:r>
+      <w:r>
+        <w:rPr>
+          <w:rFonts w:ascii="Consolas" w:hAnsi="Consolas"/>
+          <w:sz w:val="18"/>
+        </w:rPr>
+        <w:br/>
+        <w:t>// OperationStrategy defines the common contract.</w:t>
+      </w:r>
+      <w:r>
+        <w:rPr>
+          <w:rFonts w:ascii="Consolas" w:hAnsi="Consolas"/>
+          <w:sz w:val="18"/>
+        </w:rPr>
+        <w:br/>
+        <w:t>double execute(double firstNumber, double secondNumber);</w:t>
+      </w:r>
+    </w:p>
+    <w:p>
+      <w:pPr>
+        <w:pStyle w:val="Heading2"/>
+      </w:pPr>
+      <w:r>
+        <w:t>Principle 5 Separate construction from use</w:t>
+      </w:r>
+    </w:p>
+    <w:p>
+      <w:r>
+        <w:t>Chapter 11 Systems. Main constructs the concrete strategies and supplies them to Calculator. Calculator uses the interface without creating the algorithms itself. Passing a strategy through a constructor or setter is simple dependency injection and needs no framework.</w:t>
       </w:r>
     </w:p>
     <w:p>

</xml_diff>

<commit_message>
Remove repository section and set report text to black
</commit_message>
<xml_diff>
--- a/REPORT.docx
+++ b/REPORT.docx
@@ -7,6 +7,9 @@
         <w:pStyle w:val="Title"/>
       </w:pPr>
       <w:r>
+        <w:rPr>
+          <w:color w:val="000000"/>
+        </w:rPr>
         <w:t>Assignment 5 Strategy Pattern</w:t>
       </w:r>
     </w:p>
@@ -15,11 +18,17 @@
         <w:pStyle w:val="Heading1"/>
       </w:pPr>
       <w:r>
+        <w:rPr>
+          <w:color w:val="000000"/>
+        </w:rPr>
         <w:t>1 Introduction</w:t>
       </w:r>
     </w:p>
     <w:p>
       <w:r>
+        <w:rPr>
+          <w:color w:val="000000"/>
+        </w:rPr>
         <w:t>This project uses Option B, a calculator. Addition, subtraction, and multiplication are interchangeable algorithms behind the OperationStrategy interface. Calculator holds a strategy and delegates the calculation to it. Main selects the operation and changes it at runtime on the same calculator object.</w:t>
       </w:r>
     </w:p>
@@ -28,11 +37,17 @@
         <w:pStyle w:val="Heading1"/>
       </w:pPr>
       <w:r>
+        <w:rPr>
+          <w:color w:val="000000"/>
+        </w:rPr>
         <w:t>2 UML class diagram</w:t>
       </w:r>
     </w:p>
     <w:p>
       <w:r>
+        <w:rPr>
+          <w:color w:val="000000"/>
+        </w:rPr>
         <w:drawing>
           <wp:inline xmlns:a="http://schemas.openxmlformats.org/drawingml/2006/main" xmlns:pic="http://schemas.openxmlformats.org/drawingml/2006/picture">
             <wp:extent cx="6217920" cy="4248912"/>
@@ -69,11 +84,17 @@
     </w:p>
     <w:p>
       <w:r>
+        <w:rPr>
+          <w:color w:val="000000"/>
+        </w:rPr>
         <w:t>Main creates the concrete strategies and supplies them to Calculator. Dashed lines with a hollow triangle show interface implementation. Calculator holds an OperationStrategy reference and calls its execute method.</w:t>
       </w:r>
     </w:p>
     <w:p>
       <w:r>
+        <w:rPr>
+          <w:color w:val="000000"/>
+        </w:rPr>
         <w:br w:type="page"/>
       </w:r>
     </w:p>
@@ -82,11 +103,17 @@
         <w:pStyle w:val="Heading1"/>
       </w:pPr>
       <w:r>
+        <w:rPr>
+          <w:color w:val="000000"/>
+        </w:rPr>
         <w:t>3 Clean code principles</w:t>
       </w:r>
     </w:p>
     <w:p>
       <w:r>
+        <w:rPr>
+          <w:color w:val="000000"/>
+        </w:rPr>
         <w:t>Five principles from Chapters 9, 10, and 11 are applied below.</w:t>
       </w:r>
     </w:p>
@@ -95,11 +122,17 @@
         <w:pStyle w:val="Heading2"/>
       </w:pPr>
       <w:r>
+        <w:rPr>
+          <w:color w:val="000000"/>
+        </w:rPr>
         <w:t>Principle 1 Single concept per test</w:t>
       </w:r>
     </w:p>
     <w:p>
       <w:r>
+        <w:rPr>
+          <w:color w:val="000000"/>
+        </w:rPr>
         <w:t>Chapter 9 Unit Tests. Each test checks one behavior: addition, subtraction, multiplication, or runtime switching. Tests create their own calculator and have one assertion, so they do not share state or depend on execution order. This makes failures easy to locate.</w:t>
       </w:r>
     </w:p>
@@ -110,6 +143,7 @@
       <w:r>
         <w:rPr>
           <w:rFonts w:ascii="Consolas" w:hAnsi="Consolas"/>
+          <w:color w:val="000000"/>
           <w:sz w:val="18"/>
         </w:rPr>
         <w:t>private static void addsTwoNumbers() {</w:t>
@@ -117,6 +151,7 @@
       <w:r>
         <w:rPr>
           <w:rFonts w:ascii="Consolas" w:hAnsi="Consolas"/>
+          <w:color w:val="000000"/>
           <w:sz w:val="18"/>
         </w:rPr>
         <w:br/>
@@ -125,6 +160,7 @@
       <w:r>
         <w:rPr>
           <w:rFonts w:ascii="Consolas" w:hAnsi="Consolas"/>
+          <w:color w:val="000000"/>
           <w:sz w:val="18"/>
         </w:rPr>
         <w:br/>
@@ -133,6 +169,7 @@
       <w:r>
         <w:rPr>
           <w:rFonts w:ascii="Consolas" w:hAnsi="Consolas"/>
+          <w:color w:val="000000"/>
           <w:sz w:val="18"/>
         </w:rPr>
         <w:br/>
@@ -144,11 +181,17 @@
         <w:pStyle w:val="Heading2"/>
       </w:pPr>
       <w:r>
+        <w:rPr>
+          <w:color w:val="000000"/>
+        </w:rPr>
         <w:t>Principle 2 Single Responsibility Principle</w:t>
       </w:r>
     </w:p>
     <w:p>
       <w:r>
+        <w:rPr>
+          <w:color w:val="000000"/>
+        </w:rPr>
         <w:t>Chapter 10 Classes. Strategies perform arithmetic, Calculator delegates execution, and Main configures strategies and prints the demo. Each class has a focused reason to change. Changing console output does not require changing an arithmetic class.</w:t>
       </w:r>
     </w:p>
@@ -159,6 +202,7 @@
       <w:r>
         <w:rPr>
           <w:rFonts w:ascii="Consolas" w:hAnsi="Consolas"/>
+          <w:color w:val="000000"/>
           <w:sz w:val="18"/>
         </w:rPr>
         <w:t>// Calculator only delegates the calculation.</w:t>
@@ -166,6 +210,7 @@
       <w:r>
         <w:rPr>
           <w:rFonts w:ascii="Consolas" w:hAnsi="Consolas"/>
+          <w:color w:val="000000"/>
           <w:sz w:val="18"/>
         </w:rPr>
         <w:br/>
@@ -174,6 +219,7 @@
       <w:r>
         <w:rPr>
           <w:rFonts w:ascii="Consolas" w:hAnsi="Consolas"/>
+          <w:color w:val="000000"/>
           <w:sz w:val="18"/>
         </w:rPr>
         <w:br/>
@@ -182,6 +228,7 @@
       <w:r>
         <w:rPr>
           <w:rFonts w:ascii="Consolas" w:hAnsi="Consolas"/>
+          <w:color w:val="000000"/>
           <w:sz w:val="18"/>
         </w:rPr>
         <w:br/>
@@ -193,11 +240,17 @@
         <w:pStyle w:val="Heading2"/>
       </w:pPr>
       <w:r>
+        <w:rPr>
+          <w:color w:val="000000"/>
+        </w:rPr>
         <w:t>Principle 3 Cohesion</w:t>
       </w:r>
     </w:p>
     <w:p>
       <w:r>
+        <w:rPr>
+          <w:color w:val="000000"/>
+        </w:rPr>
         <w:t>Chapter 10 Classes. The constructor, setStrategy, and calculate work with the same private strategy field. The constructor initializes it through the setter, the setter updates it, and calculate uses it. These related methods belong together and support the calculator responsibility.</w:t>
       </w:r>
     </w:p>
@@ -208,6 +261,7 @@
       <w:r>
         <w:rPr>
           <w:rFonts w:ascii="Consolas" w:hAnsi="Consolas"/>
+          <w:color w:val="000000"/>
           <w:sz w:val="18"/>
         </w:rPr>
         <w:t>private OperationStrategy strategy; // Shared state.</w:t>
@@ -215,6 +269,7 @@
       <w:r>
         <w:rPr>
           <w:rFonts w:ascii="Consolas" w:hAnsi="Consolas"/>
+          <w:color w:val="000000"/>
           <w:sz w:val="18"/>
         </w:rPr>
         <w:br/>
@@ -223,6 +278,7 @@
       <w:r>
         <w:rPr>
           <w:rFonts w:ascii="Consolas" w:hAnsi="Consolas"/>
+          <w:color w:val="000000"/>
           <w:sz w:val="18"/>
         </w:rPr>
         <w:br/>
@@ -231,6 +287,7 @@
       <w:r>
         <w:rPr>
           <w:rFonts w:ascii="Consolas" w:hAnsi="Consolas"/>
+          <w:color w:val="000000"/>
           <w:sz w:val="18"/>
         </w:rPr>
         <w:br/>
@@ -239,6 +296,7 @@
       <w:r>
         <w:rPr>
           <w:rFonts w:ascii="Consolas" w:hAnsi="Consolas"/>
+          <w:color w:val="000000"/>
           <w:sz w:val="18"/>
         </w:rPr>
         <w:br/>
@@ -247,6 +305,7 @@
       <w:r>
         <w:rPr>
           <w:rFonts w:ascii="Consolas" w:hAnsi="Consolas"/>
+          <w:color w:val="000000"/>
           <w:sz w:val="18"/>
         </w:rPr>
         <w:br/>
@@ -255,6 +314,7 @@
       <w:r>
         <w:rPr>
           <w:rFonts w:ascii="Consolas" w:hAnsi="Consolas"/>
+          <w:color w:val="000000"/>
           <w:sz w:val="18"/>
         </w:rPr>
         <w:br/>
@@ -263,6 +323,9 @@
     </w:p>
     <w:p>
       <w:r>
+        <w:rPr>
+          <w:color w:val="000000"/>
+        </w:rPr>
         <w:br w:type="page"/>
       </w:r>
     </w:p>
@@ -271,6 +334,9 @@
         <w:pStyle w:val="Heading1"/>
       </w:pPr>
       <w:r>
+        <w:rPr>
+          <w:color w:val="000000"/>
+        </w:rPr>
         <w:t>Clean code principles continued</w:t>
       </w:r>
     </w:p>
@@ -279,11 +345,17 @@
         <w:pStyle w:val="Heading2"/>
       </w:pPr>
       <w:r>
+        <w:rPr>
+          <w:color w:val="000000"/>
+        </w:rPr>
         <w:t>Principle 4 Isolating from change</w:t>
       </w:r>
     </w:p>
     <w:p>
       <w:r>
+        <w:rPr>
+          <w:color w:val="000000"/>
+        </w:rPr>
         <w:t>Chapter 10 Classes. Calculator depends on the OperationStrategy interface, so changing an arithmetic implementation does not require changing the context. Division can be added with a new implementation selected in Main. The existing context and strategies stay unchanged; the client still needs to configure the new operation.</w:t>
       </w:r>
     </w:p>
@@ -294,6 +366,7 @@
       <w:r>
         <w:rPr>
           <w:rFonts w:ascii="Consolas" w:hAnsi="Consolas"/>
+          <w:color w:val="000000"/>
           <w:sz w:val="18"/>
         </w:rPr>
         <w:t>// Calculator depends on an interface, not AddStrategy or MultiplyStrategy.</w:t>
@@ -301,6 +374,7 @@
       <w:r>
         <w:rPr>
           <w:rFonts w:ascii="Consolas" w:hAnsi="Consolas"/>
+          <w:color w:val="000000"/>
           <w:sz w:val="18"/>
         </w:rPr>
         <w:br/>
@@ -309,6 +383,7 @@
       <w:r>
         <w:rPr>
           <w:rFonts w:ascii="Consolas" w:hAnsi="Consolas"/>
+          <w:color w:val="000000"/>
           <w:sz w:val="18"/>
         </w:rPr>
         <w:br/>
@@ -316,6 +391,7 @@
       <w:r>
         <w:rPr>
           <w:rFonts w:ascii="Consolas" w:hAnsi="Consolas"/>
+          <w:color w:val="000000"/>
           <w:sz w:val="18"/>
         </w:rPr>
         <w:br/>
@@ -324,6 +400,7 @@
       <w:r>
         <w:rPr>
           <w:rFonts w:ascii="Consolas" w:hAnsi="Consolas"/>
+          <w:color w:val="000000"/>
           <w:sz w:val="18"/>
         </w:rPr>
         <w:br/>
@@ -335,11 +412,17 @@
         <w:pStyle w:val="Heading2"/>
       </w:pPr>
       <w:r>
+        <w:rPr>
+          <w:color w:val="000000"/>
+        </w:rPr>
         <w:t>Principle 5 Separate construction from use</w:t>
       </w:r>
     </w:p>
     <w:p>
       <w:r>
+        <w:rPr>
+          <w:color w:val="000000"/>
+        </w:rPr>
         <w:t>Chapter 11 Systems. Main constructs the concrete strategies and supplies them to Calculator. Calculator uses the interface without creating the algorithms itself. Passing a strategy through a constructor or setter is simple dependency injection and needs no framework.</w:t>
       </w:r>
     </w:p>
@@ -350,6 +433,7 @@
       <w:r>
         <w:rPr>
           <w:rFonts w:ascii="Consolas" w:hAnsi="Consolas"/>
+          <w:color w:val="000000"/>
           <w:sz w:val="18"/>
         </w:rPr>
         <w:t>// Main constructs and supplies the algorithm.</w:t>
@@ -357,6 +441,7 @@
       <w:r>
         <w:rPr>
           <w:rFonts w:ascii="Consolas" w:hAnsi="Consolas"/>
+          <w:color w:val="000000"/>
           <w:sz w:val="18"/>
         </w:rPr>
         <w:br/>
@@ -365,6 +450,7 @@
       <w:r>
         <w:rPr>
           <w:rFonts w:ascii="Consolas" w:hAnsi="Consolas"/>
+          <w:color w:val="000000"/>
           <w:sz w:val="18"/>
         </w:rPr>
         <w:br/>
@@ -373,6 +459,7 @@
       <w:r>
         <w:rPr>
           <w:rFonts w:ascii="Consolas" w:hAnsi="Consolas"/>
+          <w:color w:val="000000"/>
           <w:sz w:val="18"/>
         </w:rPr>
         <w:br/>
@@ -384,25 +471,18 @@
         <w:pStyle w:val="Heading1"/>
       </w:pPr>
       <w:r>
+        <w:rPr>
+          <w:color w:val="000000"/>
+        </w:rPr>
         <w:t>4 Conclusion</w:t>
       </w:r>
     </w:p>
     <w:p>
       <w:r>
+        <w:rPr>
+          <w:color w:val="000000"/>
+        </w:rPr>
         <w:t>The demo adds, subtracts, multiplies, and switches back to addition. Calculator has no if or switch for operation types. A new operation requires another strategy and client code to select it; existing strategies and Calculator stay unchanged. The extra classes add structure to a basic calculator but make algorithms easy to replace. All four tests pass.</w:t>
-      </w:r>
-    </w:p>
-    <w:p>
-      <w:pPr>
-        <w:pStyle w:val="Heading1"/>
-      </w:pPr>
-      <w:r>
-        <w:t>5 GitHub repository</w:t>
-      </w:r>
-    </w:p>
-    <w:p>
-      <w:r>
-        <w:t>Repository link: Add the GitHub URL after publishing this project.</w:t>
       </w:r>
     </w:p>
     <w:sectPr>
@@ -783,6 +863,7 @@
     </w:pPr>
     <w:rPr>
       <w:rFonts w:ascii="Calibri" w:hAnsi="Calibri"/>
+      <w:color w:val="000000"/>
       <w:sz w:val="22"/>
     </w:rPr>
   </w:style>
@@ -800,6 +881,9 @@
       </w:tabs>
       <w:spacing w:after="0" w:line="240" w:lineRule="auto"/>
     </w:pPr>
+    <w:rPr>
+      <w:color w:val="000000"/>
+    </w:rPr>
   </w:style>
   <w:style w:type="character" w:customStyle="1" w:styleId="HeaderChar">
     <w:name w:val="Header Char"/>
@@ -807,6 +891,9 @@
     <w:link w:val="Header"/>
     <w:uiPriority w:val="99"/>
     <w:rsid w:val="00E618BF"/>
+    <w:rPr>
+      <w:color w:val="000000"/>
+    </w:rPr>
   </w:style>
   <w:style w:type="paragraph" w:styleId="Footer">
     <w:name w:val="footer"/>
@@ -822,6 +909,9 @@
       </w:tabs>
       <w:spacing w:after="0" w:line="240" w:lineRule="auto"/>
     </w:pPr>
+    <w:rPr>
+      <w:color w:val="000000"/>
+    </w:rPr>
   </w:style>
   <w:style w:type="character" w:customStyle="1" w:styleId="FooterChar">
     <w:name w:val="Footer Char"/>
@@ -829,6 +919,9 @@
     <w:link w:val="Footer"/>
     <w:uiPriority w:val="99"/>
     <w:rsid w:val="00E618BF"/>
+    <w:rPr>
+      <w:color w:val="000000"/>
+    </w:rPr>
   </w:style>
   <w:style w:type="paragraph" w:styleId="Heading1">
     <w:name w:val="heading 1"/>
@@ -896,7 +989,7 @@
       <w:rFonts w:asciiTheme="majorHAnsi" w:eastAsiaTheme="majorEastAsia" w:hAnsiTheme="majorHAnsi" w:cstheme="majorBidi"/>
       <w:b/>
       <w:bCs/>
-      <w:color w:val="4F81BD" w:themeColor="accent1"/>
+      <w:color w:val="000000"/>
     </w:rPr>
   </w:style>
   <w:style w:type="paragraph" w:styleId="Heading4">
@@ -921,7 +1014,7 @@
       <w:bCs/>
       <w:i/>
       <w:iCs/>
-      <w:color w:val="4F81BD" w:themeColor="accent1"/>
+      <w:color w:val="000000"/>
     </w:rPr>
   </w:style>
   <w:style w:type="paragraph" w:styleId="Heading5">
@@ -942,7 +1035,7 @@
     </w:pPr>
     <w:rPr>
       <w:rFonts w:asciiTheme="majorHAnsi" w:eastAsiaTheme="majorEastAsia" w:hAnsiTheme="majorHAnsi" w:cstheme="majorBidi"/>
-      <w:color w:val="243F60" w:themeColor="accent1" w:themeShade="7F"/>
+      <w:color w:val="000000"/>
     </w:rPr>
   </w:style>
   <w:style w:type="paragraph" w:styleId="Heading6">
@@ -965,7 +1058,7 @@
       <w:rFonts w:asciiTheme="majorHAnsi" w:eastAsiaTheme="majorEastAsia" w:hAnsiTheme="majorHAnsi" w:cstheme="majorBidi"/>
       <w:i/>
       <w:iCs/>
-      <w:color w:val="243F60" w:themeColor="accent1" w:themeShade="7F"/>
+      <w:color w:val="000000"/>
     </w:rPr>
   </w:style>
   <w:style w:type="paragraph" w:styleId="Heading7">
@@ -988,7 +1081,7 @@
       <w:rFonts w:asciiTheme="majorHAnsi" w:eastAsiaTheme="majorEastAsia" w:hAnsiTheme="majorHAnsi" w:cstheme="majorBidi"/>
       <w:i/>
       <w:iCs/>
-      <w:color w:val="404040" w:themeColor="text1" w:themeTint="BF"/>
+      <w:color w:val="000000"/>
     </w:rPr>
   </w:style>
   <w:style w:type="paragraph" w:styleId="Heading8">
@@ -1009,7 +1102,7 @@
     </w:pPr>
     <w:rPr>
       <w:rFonts w:asciiTheme="majorHAnsi" w:eastAsiaTheme="majorEastAsia" w:hAnsiTheme="majorHAnsi" w:cstheme="majorBidi"/>
-      <w:color w:val="4F81BD" w:themeColor="accent1"/>
+      <w:color w:val="000000"/>
       <w:sz w:val="20"/>
       <w:szCs w:val="20"/>
     </w:rPr>
@@ -1034,7 +1127,7 @@
       <w:rFonts w:asciiTheme="majorHAnsi" w:eastAsiaTheme="majorEastAsia" w:hAnsiTheme="majorHAnsi" w:cstheme="majorBidi"/>
       <w:i/>
       <w:iCs/>
-      <w:color w:val="404040" w:themeColor="text1" w:themeTint="BF"/>
+      <w:color w:val="000000"/>
       <w:sz w:val="20"/>
       <w:szCs w:val="20"/>
     </w:rPr>
@@ -1044,12 +1137,18 @@
     <w:uiPriority w:val="1"/>
     <w:semiHidden/>
     <w:unhideWhenUsed/>
+    <w:rPr>
+      <w:color w:val="000000"/>
+    </w:rPr>
   </w:style>
   <w:style w:type="table" w:default="1" w:styleId="TableNormal">
     <w:name w:val="Normal Table"/>
     <w:uiPriority w:val="99"/>
     <w:semiHidden/>
     <w:unhideWhenUsed/>
+    <w:rPr>
+      <w:color w:val="000000"/>
+    </w:rPr>
     <w:tblPr>
       <w:tblInd w:w="0" w:type="dxa"/>
       <w:tblCellMar>
@@ -1074,6 +1173,9 @@
     <w:pPr>
       <w:spacing w:after="0" w:line="240" w:lineRule="auto"/>
     </w:pPr>
+    <w:rPr>
+      <w:color w:val="000000"/>
+    </w:rPr>
   </w:style>
   <w:style w:type="character" w:customStyle="1" w:styleId="Heading1Char">
     <w:name w:val="Heading 1 Char"/>
@@ -1085,7 +1187,7 @@
       <w:rFonts w:asciiTheme="majorHAnsi" w:eastAsiaTheme="majorEastAsia" w:hAnsiTheme="majorHAnsi" w:cstheme="majorBidi"/>
       <w:b/>
       <w:bCs/>
-      <w:color w:val="365F91" w:themeColor="accent1" w:themeShade="BF"/>
+      <w:color w:val="000000"/>
       <w:sz w:val="28"/>
       <w:szCs w:val="28"/>
     </w:rPr>
@@ -1100,7 +1202,7 @@
       <w:rFonts w:asciiTheme="majorHAnsi" w:eastAsiaTheme="majorEastAsia" w:hAnsiTheme="majorHAnsi" w:cstheme="majorBidi"/>
       <w:b/>
       <w:bCs/>
-      <w:color w:val="4F81BD" w:themeColor="accent1"/>
+      <w:color w:val="000000"/>
       <w:sz w:val="26"/>
       <w:szCs w:val="26"/>
     </w:rPr>
@@ -1115,7 +1217,7 @@
       <w:rFonts w:asciiTheme="majorHAnsi" w:eastAsiaTheme="majorEastAsia" w:hAnsiTheme="majorHAnsi" w:cstheme="majorBidi"/>
       <w:b/>
       <w:bCs/>
-      <w:color w:val="4F81BD" w:themeColor="accent1"/>
+      <w:color w:val="000000"/>
     </w:rPr>
   </w:style>
   <w:style w:type="paragraph" w:styleId="Title">
@@ -1147,7 +1249,7 @@
     <w:rsid w:val="00FC693F"/>
     <w:rPr>
       <w:rFonts w:asciiTheme="majorHAnsi" w:eastAsiaTheme="majorEastAsia" w:hAnsiTheme="majorHAnsi" w:cstheme="majorBidi"/>
-      <w:color w:val="17365D" w:themeColor="text2" w:themeShade="BF"/>
+      <w:color w:val="000000"/>
       <w:spacing w:val="5"/>
       <w:kern w:val="28"/>
       <w:sz w:val="52"/>
@@ -1171,7 +1273,7 @@
       <w:rFonts w:asciiTheme="majorHAnsi" w:eastAsiaTheme="majorEastAsia" w:hAnsiTheme="majorHAnsi" w:cstheme="majorBidi"/>
       <w:i/>
       <w:iCs/>
-      <w:color w:val="4F81BD" w:themeColor="accent1"/>
+      <w:color w:val="000000"/>
       <w:spacing w:val="15"/>
       <w:sz w:val="24"/>
       <w:szCs w:val="24"/>
@@ -1187,7 +1289,7 @@
       <w:rFonts w:asciiTheme="majorHAnsi" w:eastAsiaTheme="majorEastAsia" w:hAnsiTheme="majorHAnsi" w:cstheme="majorBidi"/>
       <w:i/>
       <w:iCs/>
-      <w:color w:val="4F81BD" w:themeColor="accent1"/>
+      <w:color w:val="000000"/>
       <w:spacing w:val="15"/>
       <w:sz w:val="24"/>
       <w:szCs w:val="24"/>
@@ -1203,6 +1305,9 @@
       <w:ind w:left="720"/>
       <w:contextualSpacing/>
     </w:pPr>
+    <w:rPr>
+      <w:color w:val="000000"/>
+    </w:rPr>
   </w:style>
   <w:style w:type="paragraph" w:styleId="BodyText">
     <w:name w:val="Body Text"/>
@@ -1214,6 +1319,9 @@
     <w:pPr>
       <w:spacing w:after="120"/>
     </w:pPr>
+    <w:rPr>
+      <w:color w:val="000000"/>
+    </w:rPr>
   </w:style>
   <w:style w:type="character" w:customStyle="1" w:styleId="BodyTextChar">
     <w:name w:val="Body Text Char"/>
@@ -1221,6 +1329,9 @@
     <w:link w:val="BodyText"/>
     <w:uiPriority w:val="99"/>
     <w:rsid w:val="00AA1D8D"/>
+    <w:rPr>
+      <w:color w:val="000000"/>
+    </w:rPr>
   </w:style>
   <w:style w:type="paragraph" w:styleId="BodyText2">
     <w:name w:val="Body Text 2"/>
@@ -1232,6 +1343,9 @@
     <w:pPr>
       <w:spacing w:after="120" w:line="480" w:lineRule="auto"/>
     </w:pPr>
+    <w:rPr>
+      <w:color w:val="000000"/>
+    </w:rPr>
   </w:style>
   <w:style w:type="character" w:customStyle="1" w:styleId="BodyText2Char">
     <w:name w:val="Body Text 2 Char"/>
@@ -1239,6 +1353,9 @@
     <w:link w:val="BodyText2"/>
     <w:uiPriority w:val="99"/>
     <w:rsid w:val="00AA1D8D"/>
+    <w:rPr>
+      <w:color w:val="000000"/>
+    </w:rPr>
   </w:style>
   <w:style w:type="paragraph" w:styleId="BodyText3">
     <w:name w:val="Body Text 3"/>
@@ -1251,6 +1368,7 @@
       <w:spacing w:after="120"/>
     </w:pPr>
     <w:rPr>
+      <w:color w:val="000000"/>
       <w:sz w:val="16"/>
       <w:szCs w:val="16"/>
     </w:rPr>
@@ -1262,6 +1380,7 @@
     <w:uiPriority w:val="99"/>
     <w:rsid w:val="00AA1D8D"/>
     <w:rPr>
+      <w:color w:val="000000"/>
       <w:sz w:val="16"/>
       <w:szCs w:val="16"/>
     </w:rPr>
@@ -1276,6 +1395,9 @@
       <w:ind w:left="360" w:hanging="360"/>
       <w:contextualSpacing/>
     </w:pPr>
+    <w:rPr>
+      <w:color w:val="000000"/>
+    </w:rPr>
   </w:style>
   <w:style w:type="paragraph" w:styleId="List2">
     <w:name w:val="List 2"/>
@@ -1287,6 +1409,9 @@
       <w:ind w:left="720" w:hanging="360"/>
       <w:contextualSpacing/>
     </w:pPr>
+    <w:rPr>
+      <w:color w:val="000000"/>
+    </w:rPr>
   </w:style>
   <w:style w:type="paragraph" w:styleId="List3">
     <w:name w:val="List 3"/>
@@ -1298,6 +1423,9 @@
       <w:ind w:left="1080" w:hanging="360"/>
       <w:contextualSpacing/>
     </w:pPr>
+    <w:rPr>
+      <w:color w:val="000000"/>
+    </w:rPr>
   </w:style>
   <w:style w:type="paragraph" w:styleId="ListBullet">
     <w:name w:val="List Bullet"/>
@@ -1311,6 +1439,9 @@
       </w:numPr>
       <w:contextualSpacing/>
     </w:pPr>
+    <w:rPr>
+      <w:color w:val="000000"/>
+    </w:rPr>
   </w:style>
   <w:style w:type="paragraph" w:styleId="ListBullet2">
     <w:name w:val="List Bullet 2"/>
@@ -1324,6 +1455,9 @@
       </w:numPr>
       <w:contextualSpacing/>
     </w:pPr>
+    <w:rPr>
+      <w:color w:val="000000"/>
+    </w:rPr>
   </w:style>
   <w:style w:type="paragraph" w:styleId="ListBullet3">
     <w:name w:val="List Bullet 3"/>
@@ -1337,6 +1471,9 @@
       </w:numPr>
       <w:contextualSpacing/>
     </w:pPr>
+    <w:rPr>
+      <w:color w:val="000000"/>
+    </w:rPr>
   </w:style>
   <w:style w:type="paragraph" w:styleId="ListNumber">
     <w:name w:val="List Number"/>
@@ -1350,6 +1487,9 @@
       </w:numPr>
       <w:contextualSpacing/>
     </w:pPr>
+    <w:rPr>
+      <w:color w:val="000000"/>
+    </w:rPr>
   </w:style>
   <w:style w:type="paragraph" w:styleId="ListNumber2">
     <w:name w:val="List Number 2"/>
@@ -1363,6 +1503,9 @@
       </w:numPr>
       <w:contextualSpacing/>
     </w:pPr>
+    <w:rPr>
+      <w:color w:val="000000"/>
+    </w:rPr>
   </w:style>
   <w:style w:type="paragraph" w:styleId="ListNumber3">
     <w:name w:val="List Number 3"/>
@@ -1376,6 +1519,9 @@
       </w:numPr>
       <w:contextualSpacing/>
     </w:pPr>
+    <w:rPr>
+      <w:color w:val="000000"/>
+    </w:rPr>
   </w:style>
   <w:style w:type="paragraph" w:styleId="ListContinue">
     <w:name w:val="List Continue"/>
@@ -1388,6 +1534,9 @@
       <w:ind w:left="360"/>
       <w:contextualSpacing/>
     </w:pPr>
+    <w:rPr>
+      <w:color w:val="000000"/>
+    </w:rPr>
   </w:style>
   <w:style w:type="paragraph" w:styleId="ListContinue2">
     <w:name w:val="List Continue 2"/>
@@ -1400,6 +1549,9 @@
       <w:ind w:left="720"/>
       <w:contextualSpacing/>
     </w:pPr>
+    <w:rPr>
+      <w:color w:val="000000"/>
+    </w:rPr>
   </w:style>
   <w:style w:type="paragraph" w:styleId="ListContinue3">
     <w:name w:val="List Continue 3"/>
@@ -1412,6 +1564,9 @@
       <w:ind w:left="1080"/>
       <w:contextualSpacing/>
     </w:pPr>
+    <w:rPr>
+      <w:color w:val="000000"/>
+    </w:rPr>
   </w:style>
   <w:style w:type="paragraph" w:styleId="MacroText">
     <w:name w:val="macro"/>
@@ -1432,6 +1587,7 @@
     </w:pPr>
     <w:rPr>
       <w:rFonts w:ascii="Courier" w:hAnsi="Courier"/>
+      <w:color w:val="000000"/>
       <w:sz w:val="20"/>
       <w:szCs w:val="20"/>
     </w:rPr>
@@ -1444,6 +1600,7 @@
     <w:rsid w:val="0029639D"/>
     <w:rPr>
       <w:rFonts w:ascii="Courier" w:hAnsi="Courier"/>
+      <w:color w:val="000000"/>
       <w:sz w:val="20"/>
       <w:szCs w:val="20"/>
     </w:rPr>
@@ -1459,7 +1616,7 @@
     <w:rPr>
       <w:i/>
       <w:iCs/>
-      <w:color w:val="000000" w:themeColor="text1"/>
+      <w:color w:val="000000"/>
     </w:rPr>
   </w:style>
   <w:style w:type="character" w:customStyle="1" w:styleId="QuoteChar">
@@ -1471,7 +1628,7 @@
     <w:rPr>
       <w:i/>
       <w:iCs/>
-      <w:color w:val="000000" w:themeColor="text1"/>
+      <w:color w:val="000000"/>
     </w:rPr>
   </w:style>
   <w:style w:type="character" w:customStyle="1" w:styleId="Heading4Char">
@@ -1487,7 +1644,7 @@
       <w:bCs/>
       <w:i/>
       <w:iCs/>
-      <w:color w:val="4F81BD" w:themeColor="accent1"/>
+      <w:color w:val="000000"/>
     </w:rPr>
   </w:style>
   <w:style w:type="character" w:customStyle="1" w:styleId="Heading5Char">
@@ -1499,7 +1656,7 @@
     <w:rsid w:val="00FC693F"/>
     <w:rPr>
       <w:rFonts w:asciiTheme="majorHAnsi" w:eastAsiaTheme="majorEastAsia" w:hAnsiTheme="majorHAnsi" w:cstheme="majorBidi"/>
-      <w:color w:val="243F60" w:themeColor="accent1" w:themeShade="7F"/>
+      <w:color w:val="000000"/>
     </w:rPr>
   </w:style>
   <w:style w:type="character" w:customStyle="1" w:styleId="Heading6Char">
@@ -1513,7 +1670,7 @@
       <w:rFonts w:asciiTheme="majorHAnsi" w:eastAsiaTheme="majorEastAsia" w:hAnsiTheme="majorHAnsi" w:cstheme="majorBidi"/>
       <w:i/>
       <w:iCs/>
-      <w:color w:val="243F60" w:themeColor="accent1" w:themeShade="7F"/>
+      <w:color w:val="000000"/>
     </w:rPr>
   </w:style>
   <w:style w:type="character" w:customStyle="1" w:styleId="Heading7Char">
@@ -1527,7 +1684,7 @@
       <w:rFonts w:asciiTheme="majorHAnsi" w:eastAsiaTheme="majorEastAsia" w:hAnsiTheme="majorHAnsi" w:cstheme="majorBidi"/>
       <w:i/>
       <w:iCs/>
-      <w:color w:val="404040" w:themeColor="text1" w:themeTint="BF"/>
+      <w:color w:val="000000"/>
     </w:rPr>
   </w:style>
   <w:style w:type="character" w:customStyle="1" w:styleId="Heading8Char">
@@ -1539,7 +1696,7 @@
     <w:rsid w:val="00FC693F"/>
     <w:rPr>
       <w:rFonts w:asciiTheme="majorHAnsi" w:eastAsiaTheme="majorEastAsia" w:hAnsiTheme="majorHAnsi" w:cstheme="majorBidi"/>
-      <w:color w:val="4F81BD" w:themeColor="accent1"/>
+      <w:color w:val="000000"/>
       <w:sz w:val="20"/>
       <w:szCs w:val="20"/>
     </w:rPr>
@@ -1555,7 +1712,7 @@
       <w:rFonts w:asciiTheme="majorHAnsi" w:eastAsiaTheme="majorEastAsia" w:hAnsiTheme="majorHAnsi" w:cstheme="majorBidi"/>
       <w:i/>
       <w:iCs/>
-      <w:color w:val="404040" w:themeColor="text1" w:themeTint="BF"/>
+      <w:color w:val="000000"/>
       <w:sz w:val="20"/>
       <w:szCs w:val="20"/>
     </w:rPr>
@@ -1575,7 +1732,7 @@
     <w:rPr>
       <w:b/>
       <w:bCs/>
-      <w:color w:val="4F81BD" w:themeColor="accent1"/>
+      <w:color w:val="000000"/>
       <w:sz w:val="18"/>
       <w:szCs w:val="18"/>
     </w:rPr>
@@ -1589,6 +1746,7 @@
     <w:rPr>
       <w:b/>
       <w:bCs/>
+      <w:color w:val="000000"/>
     </w:rPr>
   </w:style>
   <w:style w:type="character" w:styleId="Emphasis">
@@ -1600,6 +1758,7 @@
     <w:rPr>
       <w:i/>
       <w:iCs/>
+      <w:color w:val="000000"/>
     </w:rPr>
   </w:style>
   <w:style w:type="paragraph" w:styleId="IntenseQuote">
@@ -1622,7 +1781,7 @@
       <w:bCs/>
       <w:i/>
       <w:iCs/>
-      <w:color w:val="4F81BD" w:themeColor="accent1"/>
+      <w:color w:val="000000"/>
     </w:rPr>
   </w:style>
   <w:style w:type="character" w:customStyle="1" w:styleId="IntenseQuoteChar">
@@ -1636,7 +1795,7 @@
       <w:bCs/>
       <w:i/>
       <w:iCs/>
-      <w:color w:val="4F81BD" w:themeColor="accent1"/>
+      <w:color w:val="000000"/>
     </w:rPr>
   </w:style>
   <w:style w:type="character" w:styleId="SubtleEmphasis">
@@ -1648,7 +1807,7 @@
     <w:rPr>
       <w:i/>
       <w:iCs/>
-      <w:color w:val="808080" w:themeColor="text1" w:themeTint="7F"/>
+      <w:color w:val="000000"/>
     </w:rPr>
   </w:style>
   <w:style w:type="character" w:styleId="IntenseEmphasis">
@@ -1662,7 +1821,7 @@
       <w:bCs/>
       <w:i/>
       <w:iCs/>
-      <w:color w:val="4F81BD" w:themeColor="accent1"/>
+      <w:color w:val="000000"/>
     </w:rPr>
   </w:style>
   <w:style w:type="character" w:styleId="SubtleReference">
@@ -1673,7 +1832,7 @@
     <w:rsid w:val="00FC693F"/>
     <w:rPr>
       <w:smallCaps/>
-      <w:color w:val="C0504D" w:themeColor="accent2"/>
+      <w:color w:val="000000"/>
       <w:u w:val="single"/>
     </w:rPr>
   </w:style>
@@ -1687,7 +1846,7 @@
       <w:b/>
       <w:bCs/>
       <w:smallCaps/>
-      <w:color w:val="C0504D" w:themeColor="accent2"/>
+      <w:color w:val="000000"/>
       <w:spacing w:val="5"/>
       <w:u w:val="single"/>
     </w:rPr>
@@ -1702,6 +1861,7 @@
       <w:b/>
       <w:bCs/>
       <w:smallCaps/>
+      <w:color w:val="000000"/>
       <w:spacing w:val="5"/>
     </w:rPr>
   </w:style>
@@ -1717,6 +1877,9 @@
     <w:pPr>
       <w:outlineLvl w:val="9"/>
     </w:pPr>
+    <w:rPr>
+      <w:color w:val="000000"/>
+    </w:rPr>
   </w:style>
   <w:style w:type="table" w:styleId="TableGrid">
     <w:name w:val="Table Grid"/>
@@ -1726,6 +1889,9 @@
     <w:pPr>
       <w:spacing w:after="0" w:line="240" w:lineRule="auto"/>
     </w:pPr>
+    <w:rPr>
+      <w:color w:val="000000"/>
+    </w:rPr>
     <w:tblPr>
       <w:tblInd w:w="0" w:type="dxa"/>
       <w:tblBorders>
@@ -1753,7 +1919,7 @@
       <w:spacing w:after="0" w:line="240" w:lineRule="auto"/>
     </w:pPr>
     <w:rPr>
-      <w:color w:val="000000" w:themeColor="text1" w:themeShade="BF"/>
+      <w:color w:val="000000"/>
     </w:rPr>
     <w:tblPr>
       <w:tblStyleRowBandSize w:val="1"/>
@@ -1856,7 +2022,7 @@
       <w:spacing w:after="0" w:line="240" w:lineRule="auto"/>
     </w:pPr>
     <w:rPr>
-      <w:color w:val="365F91" w:themeColor="accent1" w:themeShade="BF"/>
+      <w:color w:val="000000"/>
     </w:rPr>
     <w:tblPr>
       <w:tblStyleRowBandSize w:val="1"/>
@@ -1959,7 +2125,7 @@
       <w:spacing w:after="0" w:line="240" w:lineRule="auto"/>
     </w:pPr>
     <w:rPr>
-      <w:color w:val="943634" w:themeColor="accent2" w:themeShade="BF"/>
+      <w:color w:val="000000"/>
     </w:rPr>
     <w:tblPr>
       <w:tblStyleRowBandSize w:val="1"/>
@@ -2062,7 +2228,7 @@
       <w:spacing w:after="0" w:line="240" w:lineRule="auto"/>
     </w:pPr>
     <w:rPr>
-      <w:color w:val="76923C" w:themeColor="accent3" w:themeShade="BF"/>
+      <w:color w:val="000000"/>
     </w:rPr>
     <w:tblPr>
       <w:tblStyleRowBandSize w:val="1"/>
@@ -2165,7 +2331,7 @@
       <w:spacing w:after="0" w:line="240" w:lineRule="auto"/>
     </w:pPr>
     <w:rPr>
-      <w:color w:val="5F497A" w:themeColor="accent4" w:themeShade="BF"/>
+      <w:color w:val="000000"/>
     </w:rPr>
     <w:tblPr>
       <w:tblStyleRowBandSize w:val="1"/>
@@ -2268,7 +2434,7 @@
       <w:spacing w:after="0" w:line="240" w:lineRule="auto"/>
     </w:pPr>
     <w:rPr>
-      <w:color w:val="31849B" w:themeColor="accent5" w:themeShade="BF"/>
+      <w:color w:val="000000"/>
     </w:rPr>
     <w:tblPr>
       <w:tblStyleRowBandSize w:val="1"/>
@@ -2371,7 +2537,7 @@
       <w:spacing w:after="0" w:line="240" w:lineRule="auto"/>
     </w:pPr>
     <w:rPr>
-      <w:color w:val="E36C0A" w:themeColor="accent6" w:themeShade="BF"/>
+      <w:color w:val="000000"/>
     </w:rPr>
     <w:tblPr>
       <w:tblStyleRowBandSize w:val="1"/>
@@ -2473,6 +2639,9 @@
     <w:pPr>
       <w:spacing w:after="0" w:line="240" w:lineRule="auto"/>
     </w:pPr>
+    <w:rPr>
+      <w:color w:val="000000"/>
+    </w:rPr>
     <w:tblPr>
       <w:tblStyleRowBandSize w:val="1"/>
       <w:tblStyleColBandSize w:val="1"/>
@@ -2565,6 +2734,9 @@
     <w:pPr>
       <w:spacing w:after="0" w:line="240" w:lineRule="auto"/>
     </w:pPr>
+    <w:rPr>
+      <w:color w:val="000000"/>
+    </w:rPr>
     <w:tblPr>
       <w:tblStyleRowBandSize w:val="1"/>
       <w:tblStyleColBandSize w:val="1"/>
@@ -2657,6 +2829,9 @@
     <w:pPr>
       <w:spacing w:after="0" w:line="240" w:lineRule="auto"/>
     </w:pPr>
+    <w:rPr>
+      <w:color w:val="000000"/>
+    </w:rPr>
     <w:tblPr>
       <w:tblStyleRowBandSize w:val="1"/>
       <w:tblStyleColBandSize w:val="1"/>
@@ -2749,6 +2924,9 @@
     <w:pPr>
       <w:spacing w:after="0" w:line="240" w:lineRule="auto"/>
     </w:pPr>
+    <w:rPr>
+      <w:color w:val="000000"/>
+    </w:rPr>
     <w:tblPr>
       <w:tblStyleRowBandSize w:val="1"/>
       <w:tblStyleColBandSize w:val="1"/>
@@ -2841,6 +3019,9 @@
     <w:pPr>
       <w:spacing w:after="0" w:line="240" w:lineRule="auto"/>
     </w:pPr>
+    <w:rPr>
+      <w:color w:val="000000"/>
+    </w:rPr>
     <w:tblPr>
       <w:tblStyleRowBandSize w:val="1"/>
       <w:tblStyleColBandSize w:val="1"/>
@@ -2933,6 +3114,9 @@
     <w:pPr>
       <w:spacing w:after="0" w:line="240" w:lineRule="auto"/>
     </w:pPr>
+    <w:rPr>
+      <w:color w:val="000000"/>
+    </w:rPr>
     <w:tblPr>
       <w:tblStyleRowBandSize w:val="1"/>
       <w:tblStyleColBandSize w:val="1"/>
@@ -3025,6 +3209,9 @@
     <w:pPr>
       <w:spacing w:after="0" w:line="240" w:lineRule="auto"/>
     </w:pPr>
+    <w:rPr>
+      <w:color w:val="000000"/>
+    </w:rPr>
     <w:tblPr>
       <w:tblStyleRowBandSize w:val="1"/>
       <w:tblStyleColBandSize w:val="1"/>
@@ -3117,6 +3304,9 @@
     <w:pPr>
       <w:spacing w:after="0" w:line="240" w:lineRule="auto"/>
     </w:pPr>
+    <w:rPr>
+      <w:color w:val="000000"/>
+    </w:rPr>
     <w:tblPr>
       <w:tblStyleRowBandSize w:val="1"/>
       <w:tblStyleColBandSize w:val="1"/>
@@ -3247,6 +3437,9 @@
     <w:pPr>
       <w:spacing w:after="0" w:line="240" w:lineRule="auto"/>
     </w:pPr>
+    <w:rPr>
+      <w:color w:val="000000"/>
+    </w:rPr>
     <w:tblPr>
       <w:tblStyleRowBandSize w:val="1"/>
       <w:tblStyleColBandSize w:val="1"/>
@@ -3377,6 +3570,9 @@
     <w:pPr>
       <w:spacing w:after="0" w:line="240" w:lineRule="auto"/>
     </w:pPr>
+    <w:rPr>
+      <w:color w:val="000000"/>
+    </w:rPr>
     <w:tblPr>
       <w:tblStyleRowBandSize w:val="1"/>
       <w:tblStyleColBandSize w:val="1"/>
@@ -3507,6 +3703,9 @@
     <w:pPr>
       <w:spacing w:after="0" w:line="240" w:lineRule="auto"/>
     </w:pPr>
+    <w:rPr>
+      <w:color w:val="000000"/>
+    </w:rPr>
     <w:tblPr>
       <w:tblStyleRowBandSize w:val="1"/>
       <w:tblStyleColBandSize w:val="1"/>
@@ -3637,6 +3836,9 @@
     <w:pPr>
       <w:spacing w:after="0" w:line="240" w:lineRule="auto"/>
     </w:pPr>
+    <w:rPr>
+      <w:color w:val="000000"/>
+    </w:rPr>
     <w:tblPr>
       <w:tblStyleRowBandSize w:val="1"/>
       <w:tblStyleColBandSize w:val="1"/>
@@ -3767,6 +3969,9 @@
     <w:pPr>
       <w:spacing w:after="0" w:line="240" w:lineRule="auto"/>
     </w:pPr>
+    <w:rPr>
+      <w:color w:val="000000"/>
+    </w:rPr>
     <w:tblPr>
       <w:tblStyleRowBandSize w:val="1"/>
       <w:tblStyleColBandSize w:val="1"/>
@@ -3897,6 +4102,9 @@
     <w:pPr>
       <w:spacing w:after="0" w:line="240" w:lineRule="auto"/>
     </w:pPr>
+    <w:rPr>
+      <w:color w:val="000000"/>
+    </w:rPr>
     <w:tblPr>
       <w:tblStyleRowBandSize w:val="1"/>
       <w:tblStyleColBandSize w:val="1"/>
@@ -4027,6 +4235,9 @@
     <w:pPr>
       <w:spacing w:after="0" w:line="240" w:lineRule="auto"/>
     </w:pPr>
+    <w:rPr>
+      <w:color w:val="000000"/>
+    </w:rPr>
     <w:tblPr>
       <w:tblStyleRowBandSize w:val="1"/>
       <w:tblStyleColBandSize w:val="1"/>
@@ -4133,6 +4344,9 @@
     <w:pPr>
       <w:spacing w:after="0" w:line="240" w:lineRule="auto"/>
     </w:pPr>
+    <w:rPr>
+      <w:color w:val="000000"/>
+    </w:rPr>
     <w:tblPr>
       <w:tblStyleRowBandSize w:val="1"/>
       <w:tblStyleColBandSize w:val="1"/>
@@ -4239,6 +4453,9 @@
     <w:pPr>
       <w:spacing w:after="0" w:line="240" w:lineRule="auto"/>
     </w:pPr>
+    <w:rPr>
+      <w:color w:val="000000"/>
+    </w:rPr>
     <w:tblPr>
       <w:tblStyleRowBandSize w:val="1"/>
       <w:tblStyleColBandSize w:val="1"/>
@@ -4345,6 +4562,9 @@
     <w:pPr>
       <w:spacing w:after="0" w:line="240" w:lineRule="auto"/>
     </w:pPr>
+    <w:rPr>
+      <w:color w:val="000000"/>
+    </w:rPr>
     <w:tblPr>
       <w:tblStyleRowBandSize w:val="1"/>
       <w:tblStyleColBandSize w:val="1"/>
@@ -4451,6 +4671,9 @@
     <w:pPr>
       <w:spacing w:after="0" w:line="240" w:lineRule="auto"/>
     </w:pPr>
+    <w:rPr>
+      <w:color w:val="000000"/>
+    </w:rPr>
     <w:tblPr>
       <w:tblStyleRowBandSize w:val="1"/>
       <w:tblStyleColBandSize w:val="1"/>
@@ -4557,6 +4780,9 @@
     <w:pPr>
       <w:spacing w:after="0" w:line="240" w:lineRule="auto"/>
     </w:pPr>
+    <w:rPr>
+      <w:color w:val="000000"/>
+    </w:rPr>
     <w:tblPr>
       <w:tblStyleRowBandSize w:val="1"/>
       <w:tblStyleColBandSize w:val="1"/>
@@ -4663,6 +4889,9 @@
     <w:pPr>
       <w:spacing w:after="0" w:line="240" w:lineRule="auto"/>
     </w:pPr>
+    <w:rPr>
+      <w:color w:val="000000"/>
+    </w:rPr>
     <w:tblPr>
       <w:tblStyleRowBandSize w:val="1"/>
       <w:tblStyleColBandSize w:val="1"/>
@@ -4769,6 +4998,9 @@
     <w:pPr>
       <w:spacing w:after="0" w:line="240" w:lineRule="auto"/>
     </w:pPr>
+    <w:rPr>
+      <w:color w:val="000000"/>
+    </w:rPr>
     <w:tblPr>
       <w:tblStyleRowBandSize w:val="1"/>
       <w:tblStyleColBandSize w:val="1"/>
@@ -4918,6 +5150,9 @@
     <w:pPr>
       <w:spacing w:after="0" w:line="240" w:lineRule="auto"/>
     </w:pPr>
+    <w:rPr>
+      <w:color w:val="000000"/>
+    </w:rPr>
     <w:tblPr>
       <w:tblStyleRowBandSize w:val="1"/>
       <w:tblStyleColBandSize w:val="1"/>
@@ -5067,6 +5302,9 @@
     <w:pPr>
       <w:spacing w:after="0" w:line="240" w:lineRule="auto"/>
     </w:pPr>
+    <w:rPr>
+      <w:color w:val="000000"/>
+    </w:rPr>
     <w:tblPr>
       <w:tblStyleRowBandSize w:val="1"/>
       <w:tblStyleColBandSize w:val="1"/>
@@ -5216,6 +5454,9 @@
     <w:pPr>
       <w:spacing w:after="0" w:line="240" w:lineRule="auto"/>
     </w:pPr>
+    <w:rPr>
+      <w:color w:val="000000"/>
+    </w:rPr>
     <w:tblPr>
       <w:tblStyleRowBandSize w:val="1"/>
       <w:tblStyleColBandSize w:val="1"/>
@@ -5365,6 +5606,9 @@
     <w:pPr>
       <w:spacing w:after="0" w:line="240" w:lineRule="auto"/>
     </w:pPr>
+    <w:rPr>
+      <w:color w:val="000000"/>
+    </w:rPr>
     <w:tblPr>
       <w:tblStyleRowBandSize w:val="1"/>
       <w:tblStyleColBandSize w:val="1"/>
@@ -5514,6 +5758,9 @@
     <w:pPr>
       <w:spacing w:after="0" w:line="240" w:lineRule="auto"/>
     </w:pPr>
+    <w:rPr>
+      <w:color w:val="000000"/>
+    </w:rPr>
     <w:tblPr>
       <w:tblStyleRowBandSize w:val="1"/>
       <w:tblStyleColBandSize w:val="1"/>
@@ -5663,6 +5910,9 @@
     <w:pPr>
       <w:spacing w:after="0" w:line="240" w:lineRule="auto"/>
     </w:pPr>
+    <w:rPr>
+      <w:color w:val="000000"/>
+    </w:rPr>
     <w:tblPr>
       <w:tblStyleRowBandSize w:val="1"/>
       <w:tblStyleColBandSize w:val="1"/>
@@ -5813,7 +6063,7 @@
       <w:spacing w:after="0" w:line="240" w:lineRule="auto"/>
     </w:pPr>
     <w:rPr>
-      <w:color w:val="000000" w:themeColor="text1"/>
+      <w:color w:val="000000"/>
     </w:rPr>
     <w:tblPr>
       <w:tblStyleRowBandSize w:val="1"/>
@@ -5897,7 +6147,7 @@
       <w:spacing w:after="0" w:line="240" w:lineRule="auto"/>
     </w:pPr>
     <w:rPr>
-      <w:color w:val="000000" w:themeColor="text1"/>
+      <w:color w:val="000000"/>
     </w:rPr>
     <w:tblPr>
       <w:tblStyleRowBandSize w:val="1"/>
@@ -5981,7 +6231,7 @@
       <w:spacing w:after="0" w:line="240" w:lineRule="auto"/>
     </w:pPr>
     <w:rPr>
-      <w:color w:val="000000" w:themeColor="text1"/>
+      <w:color w:val="000000"/>
     </w:rPr>
     <w:tblPr>
       <w:tblStyleRowBandSize w:val="1"/>
@@ -6065,7 +6315,7 @@
       <w:spacing w:after="0" w:line="240" w:lineRule="auto"/>
     </w:pPr>
     <w:rPr>
-      <w:color w:val="000000" w:themeColor="text1"/>
+      <w:color w:val="000000"/>
     </w:rPr>
     <w:tblPr>
       <w:tblStyleRowBandSize w:val="1"/>
@@ -6149,7 +6399,7 @@
       <w:spacing w:after="0" w:line="240" w:lineRule="auto"/>
     </w:pPr>
     <w:rPr>
-      <w:color w:val="000000" w:themeColor="text1"/>
+      <w:color w:val="000000"/>
     </w:rPr>
     <w:tblPr>
       <w:tblStyleRowBandSize w:val="1"/>
@@ -6233,7 +6483,7 @@
       <w:spacing w:after="0" w:line="240" w:lineRule="auto"/>
     </w:pPr>
     <w:rPr>
-      <w:color w:val="000000" w:themeColor="text1"/>
+      <w:color w:val="000000"/>
     </w:rPr>
     <w:tblPr>
       <w:tblStyleRowBandSize w:val="1"/>
@@ -6317,7 +6567,7 @@
       <w:spacing w:after="0" w:line="240" w:lineRule="auto"/>
     </w:pPr>
     <w:rPr>
-      <w:color w:val="000000" w:themeColor="text1"/>
+      <w:color w:val="000000"/>
     </w:rPr>
     <w:tblPr>
       <w:tblStyleRowBandSize w:val="1"/>
@@ -6402,7 +6652,7 @@
     </w:pPr>
     <w:rPr>
       <w:rFonts w:asciiTheme="majorHAnsi" w:eastAsiaTheme="majorEastAsia" w:hAnsiTheme="majorHAnsi" w:cstheme="majorBidi"/>
-      <w:color w:val="000000" w:themeColor="text1"/>
+      <w:color w:val="000000"/>
     </w:rPr>
     <w:tblPr>
       <w:tblStyleRowBandSize w:val="1"/>
@@ -6530,7 +6780,7 @@
     </w:pPr>
     <w:rPr>
       <w:rFonts w:asciiTheme="majorHAnsi" w:eastAsiaTheme="majorEastAsia" w:hAnsiTheme="majorHAnsi" w:cstheme="majorBidi"/>
-      <w:color w:val="000000" w:themeColor="text1"/>
+      <w:color w:val="000000"/>
     </w:rPr>
     <w:tblPr>
       <w:tblStyleRowBandSize w:val="1"/>
@@ -6658,7 +6908,7 @@
     </w:pPr>
     <w:rPr>
       <w:rFonts w:asciiTheme="majorHAnsi" w:eastAsiaTheme="majorEastAsia" w:hAnsiTheme="majorHAnsi" w:cstheme="majorBidi"/>
-      <w:color w:val="000000" w:themeColor="text1"/>
+      <w:color w:val="000000"/>
     </w:rPr>
     <w:tblPr>
       <w:tblStyleRowBandSize w:val="1"/>
@@ -6786,7 +7036,7 @@
     </w:pPr>
     <w:rPr>
       <w:rFonts w:asciiTheme="majorHAnsi" w:eastAsiaTheme="majorEastAsia" w:hAnsiTheme="majorHAnsi" w:cstheme="majorBidi"/>
-      <w:color w:val="000000" w:themeColor="text1"/>
+      <w:color w:val="000000"/>
     </w:rPr>
     <w:tblPr>
       <w:tblStyleRowBandSize w:val="1"/>
@@ -6914,7 +7164,7 @@
     </w:pPr>
     <w:rPr>
       <w:rFonts w:asciiTheme="majorHAnsi" w:eastAsiaTheme="majorEastAsia" w:hAnsiTheme="majorHAnsi" w:cstheme="majorBidi"/>
-      <w:color w:val="000000" w:themeColor="text1"/>
+      <w:color w:val="000000"/>
     </w:rPr>
     <w:tblPr>
       <w:tblStyleRowBandSize w:val="1"/>
@@ -7042,7 +7292,7 @@
     </w:pPr>
     <w:rPr>
       <w:rFonts w:asciiTheme="majorHAnsi" w:eastAsiaTheme="majorEastAsia" w:hAnsiTheme="majorHAnsi" w:cstheme="majorBidi"/>
-      <w:color w:val="000000" w:themeColor="text1"/>
+      <w:color w:val="000000"/>
     </w:rPr>
     <w:tblPr>
       <w:tblStyleRowBandSize w:val="1"/>
@@ -7170,7 +7420,7 @@
     </w:pPr>
     <w:rPr>
       <w:rFonts w:asciiTheme="majorHAnsi" w:eastAsiaTheme="majorEastAsia" w:hAnsiTheme="majorHAnsi" w:cstheme="majorBidi"/>
-      <w:color w:val="000000" w:themeColor="text1"/>
+      <w:color w:val="000000"/>
     </w:rPr>
     <w:tblPr>
       <w:tblStyleRowBandSize w:val="1"/>
@@ -7296,6 +7546,9 @@
     <w:pPr>
       <w:spacing w:after="0" w:line="240" w:lineRule="auto"/>
     </w:pPr>
+    <w:rPr>
+      <w:color w:val="000000"/>
+    </w:rPr>
     <w:tblPr>
       <w:tblStyleRowBandSize w:val="1"/>
       <w:tblStyleColBandSize w:val="1"/>
@@ -7369,6 +7622,9 @@
     <w:pPr>
       <w:spacing w:after="0" w:line="240" w:lineRule="auto"/>
     </w:pPr>
+    <w:rPr>
+      <w:color w:val="000000"/>
+    </w:rPr>
     <w:tblPr>
       <w:tblStyleRowBandSize w:val="1"/>
       <w:tblStyleColBandSize w:val="1"/>
@@ -7442,6 +7698,9 @@
     <w:pPr>
       <w:spacing w:after="0" w:line="240" w:lineRule="auto"/>
     </w:pPr>
+    <w:rPr>
+      <w:color w:val="000000"/>
+    </w:rPr>
     <w:tblPr>
       <w:tblStyleRowBandSize w:val="1"/>
       <w:tblStyleColBandSize w:val="1"/>
@@ -7515,6 +7774,9 @@
     <w:pPr>
       <w:spacing w:after="0" w:line="240" w:lineRule="auto"/>
     </w:pPr>
+    <w:rPr>
+      <w:color w:val="000000"/>
+    </w:rPr>
     <w:tblPr>
       <w:tblStyleRowBandSize w:val="1"/>
       <w:tblStyleColBandSize w:val="1"/>
@@ -7588,6 +7850,9 @@
     <w:pPr>
       <w:spacing w:after="0" w:line="240" w:lineRule="auto"/>
     </w:pPr>
+    <w:rPr>
+      <w:color w:val="000000"/>
+    </w:rPr>
     <w:tblPr>
       <w:tblStyleRowBandSize w:val="1"/>
       <w:tblStyleColBandSize w:val="1"/>
@@ -7661,6 +7926,9 @@
     <w:pPr>
       <w:spacing w:after="0" w:line="240" w:lineRule="auto"/>
     </w:pPr>
+    <w:rPr>
+      <w:color w:val="000000"/>
+    </w:rPr>
     <w:tblPr>
       <w:tblStyleRowBandSize w:val="1"/>
       <w:tblStyleColBandSize w:val="1"/>
@@ -7734,6 +8002,9 @@
     <w:pPr>
       <w:spacing w:after="0" w:line="240" w:lineRule="auto"/>
     </w:pPr>
+    <w:rPr>
+      <w:color w:val="000000"/>
+    </w:rPr>
     <w:tblPr>
       <w:tblStyleRowBandSize w:val="1"/>
       <w:tblStyleColBandSize w:val="1"/>
@@ -7809,7 +8080,7 @@
     </w:pPr>
     <w:rPr>
       <w:rFonts w:asciiTheme="majorHAnsi" w:eastAsiaTheme="majorEastAsia" w:hAnsiTheme="majorHAnsi" w:cstheme="majorBidi"/>
-      <w:color w:val="000000" w:themeColor="text1"/>
+      <w:color w:val="000000"/>
     </w:rPr>
     <w:tblPr>
       <w:tblStyleRowBandSize w:val="1"/>
@@ -7934,7 +8205,7 @@
     </w:pPr>
     <w:rPr>
       <w:rFonts w:asciiTheme="majorHAnsi" w:eastAsiaTheme="majorEastAsia" w:hAnsiTheme="majorHAnsi" w:cstheme="majorBidi"/>
-      <w:color w:val="000000" w:themeColor="text1"/>
+      <w:color w:val="000000"/>
     </w:rPr>
     <w:tblPr>
       <w:tblStyleRowBandSize w:val="1"/>
@@ -8059,7 +8330,7 @@
     </w:pPr>
     <w:rPr>
       <w:rFonts w:asciiTheme="majorHAnsi" w:eastAsiaTheme="majorEastAsia" w:hAnsiTheme="majorHAnsi" w:cstheme="majorBidi"/>
-      <w:color w:val="000000" w:themeColor="text1"/>
+      <w:color w:val="000000"/>
     </w:rPr>
     <w:tblPr>
       <w:tblStyleRowBandSize w:val="1"/>
@@ -8184,7 +8455,7 @@
     </w:pPr>
     <w:rPr>
       <w:rFonts w:asciiTheme="majorHAnsi" w:eastAsiaTheme="majorEastAsia" w:hAnsiTheme="majorHAnsi" w:cstheme="majorBidi"/>
-      <w:color w:val="000000" w:themeColor="text1"/>
+      <w:color w:val="000000"/>
     </w:rPr>
     <w:tblPr>
       <w:tblStyleRowBandSize w:val="1"/>
@@ -8309,7 +8580,7 @@
     </w:pPr>
     <w:rPr>
       <w:rFonts w:asciiTheme="majorHAnsi" w:eastAsiaTheme="majorEastAsia" w:hAnsiTheme="majorHAnsi" w:cstheme="majorBidi"/>
-      <w:color w:val="000000" w:themeColor="text1"/>
+      <w:color w:val="000000"/>
     </w:rPr>
     <w:tblPr>
       <w:tblStyleRowBandSize w:val="1"/>
@@ -8434,7 +8705,7 @@
     </w:pPr>
     <w:rPr>
       <w:rFonts w:asciiTheme="majorHAnsi" w:eastAsiaTheme="majorEastAsia" w:hAnsiTheme="majorHAnsi" w:cstheme="majorBidi"/>
-      <w:color w:val="000000" w:themeColor="text1"/>
+      <w:color w:val="000000"/>
     </w:rPr>
     <w:tblPr>
       <w:tblStyleRowBandSize w:val="1"/>
@@ -8559,7 +8830,7 @@
     </w:pPr>
     <w:rPr>
       <w:rFonts w:asciiTheme="majorHAnsi" w:eastAsiaTheme="majorEastAsia" w:hAnsiTheme="majorHAnsi" w:cstheme="majorBidi"/>
-      <w:color w:val="000000" w:themeColor="text1"/>
+      <w:color w:val="000000"/>
     </w:rPr>
     <w:tblPr>
       <w:tblStyleRowBandSize w:val="1"/>
@@ -8682,6 +8953,9 @@
     <w:pPr>
       <w:spacing w:after="0" w:line="240" w:lineRule="auto"/>
     </w:pPr>
+    <w:rPr>
+      <w:color w:val="000000"/>
+    </w:rPr>
     <w:tblPr>
       <w:tblStyleRowBandSize w:val="1"/>
       <w:tblStyleColBandSize w:val="1"/>
@@ -8823,6 +9097,9 @@
     <w:pPr>
       <w:spacing w:after="0" w:line="240" w:lineRule="auto"/>
     </w:pPr>
+    <w:rPr>
+      <w:color w:val="000000"/>
+    </w:rPr>
     <w:tblPr>
       <w:tblStyleRowBandSize w:val="1"/>
       <w:tblStyleColBandSize w:val="1"/>
@@ -8964,6 +9241,9 @@
     <w:pPr>
       <w:spacing w:after="0" w:line="240" w:lineRule="auto"/>
     </w:pPr>
+    <w:rPr>
+      <w:color w:val="000000"/>
+    </w:rPr>
     <w:tblPr>
       <w:tblStyleRowBandSize w:val="1"/>
       <w:tblStyleColBandSize w:val="1"/>
@@ -9105,6 +9385,9 @@
     <w:pPr>
       <w:spacing w:after="0" w:line="240" w:lineRule="auto"/>
     </w:pPr>
+    <w:rPr>
+      <w:color w:val="000000"/>
+    </w:rPr>
     <w:tblPr>
       <w:tblStyleRowBandSize w:val="1"/>
       <w:tblStyleColBandSize w:val="1"/>
@@ -9246,6 +9529,9 @@
     <w:pPr>
       <w:spacing w:after="0" w:line="240" w:lineRule="auto"/>
     </w:pPr>
+    <w:rPr>
+      <w:color w:val="000000"/>
+    </w:rPr>
     <w:tblPr>
       <w:tblStyleRowBandSize w:val="1"/>
       <w:tblStyleColBandSize w:val="1"/>
@@ -9387,6 +9673,9 @@
     <w:pPr>
       <w:spacing w:after="0" w:line="240" w:lineRule="auto"/>
     </w:pPr>
+    <w:rPr>
+      <w:color w:val="000000"/>
+    </w:rPr>
     <w:tblPr>
       <w:tblStyleRowBandSize w:val="1"/>
       <w:tblStyleColBandSize w:val="1"/>
@@ -9528,6 +9817,9 @@
     <w:pPr>
       <w:spacing w:after="0" w:line="240" w:lineRule="auto"/>
     </w:pPr>
+    <w:rPr>
+      <w:color w:val="000000"/>
+    </w:rPr>
     <w:tblPr>
       <w:tblStyleRowBandSize w:val="1"/>
       <w:tblStyleColBandSize w:val="1"/>
@@ -9670,7 +9962,7 @@
       <w:spacing w:after="0" w:line="240" w:lineRule="auto"/>
     </w:pPr>
     <w:rPr>
-      <w:color w:val="FFFFFF" w:themeColor="background1"/>
+      <w:color w:val="000000"/>
     </w:rPr>
     <w:tblPr>
       <w:tblStyleRowBandSize w:val="1"/>
@@ -9784,7 +10076,7 @@
       <w:spacing w:after="0" w:line="240" w:lineRule="auto"/>
     </w:pPr>
     <w:rPr>
-      <w:color w:val="FFFFFF" w:themeColor="background1"/>
+      <w:color w:val="000000"/>
     </w:rPr>
     <w:tblPr>
       <w:tblStyleRowBandSize w:val="1"/>
@@ -9898,7 +10190,7 @@
       <w:spacing w:after="0" w:line="240" w:lineRule="auto"/>
     </w:pPr>
     <w:rPr>
-      <w:color w:val="FFFFFF" w:themeColor="background1"/>
+      <w:color w:val="000000"/>
     </w:rPr>
     <w:tblPr>
       <w:tblStyleRowBandSize w:val="1"/>
@@ -10012,7 +10304,7 @@
       <w:spacing w:after="0" w:line="240" w:lineRule="auto"/>
     </w:pPr>
     <w:rPr>
-      <w:color w:val="FFFFFF" w:themeColor="background1"/>
+      <w:color w:val="000000"/>
     </w:rPr>
     <w:tblPr>
       <w:tblStyleRowBandSize w:val="1"/>
@@ -10126,7 +10418,7 @@
       <w:spacing w:after="0" w:line="240" w:lineRule="auto"/>
     </w:pPr>
     <w:rPr>
-      <w:color w:val="FFFFFF" w:themeColor="background1"/>
+      <w:color w:val="000000"/>
     </w:rPr>
     <w:tblPr>
       <w:tblStyleRowBandSize w:val="1"/>
@@ -10240,7 +10532,7 @@
       <w:spacing w:after="0" w:line="240" w:lineRule="auto"/>
     </w:pPr>
     <w:rPr>
-      <w:color w:val="FFFFFF" w:themeColor="background1"/>
+      <w:color w:val="000000"/>
     </w:rPr>
     <w:tblPr>
       <w:tblStyleRowBandSize w:val="1"/>
@@ -10354,7 +10646,7 @@
       <w:spacing w:after="0" w:line="240" w:lineRule="auto"/>
     </w:pPr>
     <w:rPr>
-      <w:color w:val="FFFFFF" w:themeColor="background1"/>
+      <w:color w:val="000000"/>
     </w:rPr>
     <w:tblPr>
       <w:tblStyleRowBandSize w:val="1"/>
@@ -10468,7 +10760,7 @@
       <w:spacing w:after="0" w:line="240" w:lineRule="auto"/>
     </w:pPr>
     <w:rPr>
-      <w:color w:val="000000" w:themeColor="text1"/>
+      <w:color w:val="000000"/>
     </w:rPr>
     <w:tblPr>
       <w:tblStyleRowBandSize w:val="1"/>
@@ -10590,7 +10882,7 @@
       <w:spacing w:after="0" w:line="240" w:lineRule="auto"/>
     </w:pPr>
     <w:rPr>
-      <w:color w:val="000000" w:themeColor="text1"/>
+      <w:color w:val="000000"/>
     </w:rPr>
     <w:tblPr>
       <w:tblStyleRowBandSize w:val="1"/>
@@ -10712,7 +11004,7 @@
       <w:spacing w:after="0" w:line="240" w:lineRule="auto"/>
     </w:pPr>
     <w:rPr>
-      <w:color w:val="000000" w:themeColor="text1"/>
+      <w:color w:val="000000"/>
     </w:rPr>
     <w:tblPr>
       <w:tblStyleRowBandSize w:val="1"/>
@@ -10834,7 +11126,7 @@
       <w:spacing w:after="0" w:line="240" w:lineRule="auto"/>
     </w:pPr>
     <w:rPr>
-      <w:color w:val="000000" w:themeColor="text1"/>
+      <w:color w:val="000000"/>
     </w:rPr>
     <w:tblPr>
       <w:tblStyleRowBandSize w:val="1"/>
@@ -10946,7 +11238,7 @@
       <w:spacing w:after="0" w:line="240" w:lineRule="auto"/>
     </w:pPr>
     <w:rPr>
-      <w:color w:val="000000" w:themeColor="text1"/>
+      <w:color w:val="000000"/>
     </w:rPr>
     <w:tblPr>
       <w:tblStyleRowBandSize w:val="1"/>
@@ -11068,7 +11360,7 @@
       <w:spacing w:after="0" w:line="240" w:lineRule="auto"/>
     </w:pPr>
     <w:rPr>
-      <w:color w:val="000000" w:themeColor="text1"/>
+      <w:color w:val="000000"/>
     </w:rPr>
     <w:tblPr>
       <w:tblStyleRowBandSize w:val="1"/>
@@ -11190,7 +11482,7 @@
       <w:spacing w:after="0" w:line="240" w:lineRule="auto"/>
     </w:pPr>
     <w:rPr>
-      <w:color w:val="000000" w:themeColor="text1"/>
+      <w:color w:val="000000"/>
     </w:rPr>
     <w:tblPr>
       <w:tblStyleRowBandSize w:val="1"/>
@@ -11312,7 +11604,7 @@
       <w:spacing w:after="0" w:line="240" w:lineRule="auto"/>
     </w:pPr>
     <w:rPr>
-      <w:color w:val="000000" w:themeColor="text1"/>
+      <w:color w:val="000000"/>
     </w:rPr>
     <w:tblPr>
       <w:tblStyleRowBandSize w:val="1"/>
@@ -11398,7 +11690,7 @@
       <w:spacing w:after="0" w:line="240" w:lineRule="auto"/>
     </w:pPr>
     <w:rPr>
-      <w:color w:val="000000" w:themeColor="text1"/>
+      <w:color w:val="000000"/>
     </w:rPr>
     <w:tblPr>
       <w:tblStyleRowBandSize w:val="1"/>
@@ -11484,7 +11776,7 @@
       <w:spacing w:after="0" w:line="240" w:lineRule="auto"/>
     </w:pPr>
     <w:rPr>
-      <w:color w:val="000000" w:themeColor="text1"/>
+      <w:color w:val="000000"/>
     </w:rPr>
     <w:tblPr>
       <w:tblStyleRowBandSize w:val="1"/>
@@ -11570,7 +11862,7 @@
       <w:spacing w:after="0" w:line="240" w:lineRule="auto"/>
     </w:pPr>
     <w:rPr>
-      <w:color w:val="000000" w:themeColor="text1"/>
+      <w:color w:val="000000"/>
     </w:rPr>
     <w:tblPr>
       <w:tblStyleRowBandSize w:val="1"/>
@@ -11656,7 +11948,7 @@
       <w:spacing w:after="0" w:line="240" w:lineRule="auto"/>
     </w:pPr>
     <w:rPr>
-      <w:color w:val="000000" w:themeColor="text1"/>
+      <w:color w:val="000000"/>
     </w:rPr>
     <w:tblPr>
       <w:tblStyleRowBandSize w:val="1"/>
@@ -11742,7 +12034,7 @@
       <w:spacing w:after="0" w:line="240" w:lineRule="auto"/>
     </w:pPr>
     <w:rPr>
-      <w:color w:val="000000" w:themeColor="text1"/>
+      <w:color w:val="000000"/>
     </w:rPr>
     <w:tblPr>
       <w:tblStyleRowBandSize w:val="1"/>
@@ -11828,7 +12120,7 @@
       <w:spacing w:after="0" w:line="240" w:lineRule="auto"/>
     </w:pPr>
     <w:rPr>
-      <w:color w:val="000000" w:themeColor="text1"/>
+      <w:color w:val="000000"/>
     </w:rPr>
     <w:tblPr>
       <w:tblStyleRowBandSize w:val="1"/>
@@ -11914,7 +12206,7 @@
       <w:spacing w:after="0" w:line="240" w:lineRule="auto"/>
     </w:pPr>
     <w:rPr>
-      <w:color w:val="000000" w:themeColor="text1"/>
+      <w:color w:val="000000"/>
     </w:rPr>
     <w:tblPr>
       <w:tblStyleRowBandSize w:val="1"/>
@@ -11994,7 +12286,7 @@
       <w:spacing w:after="0" w:line="240" w:lineRule="auto"/>
     </w:pPr>
     <w:rPr>
-      <w:color w:val="000000" w:themeColor="text1"/>
+      <w:color w:val="000000"/>
     </w:rPr>
     <w:tblPr>
       <w:tblStyleRowBandSize w:val="1"/>
@@ -12074,7 +12366,7 @@
       <w:spacing w:after="0" w:line="240" w:lineRule="auto"/>
     </w:pPr>
     <w:rPr>
-      <w:color w:val="000000" w:themeColor="text1"/>
+      <w:color w:val="000000"/>
     </w:rPr>
     <w:tblPr>
       <w:tblStyleRowBandSize w:val="1"/>
@@ -12154,7 +12446,7 @@
       <w:spacing w:after="0" w:line="240" w:lineRule="auto"/>
     </w:pPr>
     <w:rPr>
-      <w:color w:val="000000" w:themeColor="text1"/>
+      <w:color w:val="000000"/>
     </w:rPr>
     <w:tblPr>
       <w:tblStyleRowBandSize w:val="1"/>
@@ -12234,7 +12526,7 @@
       <w:spacing w:after="0" w:line="240" w:lineRule="auto"/>
     </w:pPr>
     <w:rPr>
-      <w:color w:val="000000" w:themeColor="text1"/>
+      <w:color w:val="000000"/>
     </w:rPr>
     <w:tblPr>
       <w:tblStyleRowBandSize w:val="1"/>
@@ -12314,7 +12606,7 @@
       <w:spacing w:after="0" w:line="240" w:lineRule="auto"/>
     </w:pPr>
     <w:rPr>
-      <w:color w:val="000000" w:themeColor="text1"/>
+      <w:color w:val="000000"/>
     </w:rPr>
     <w:tblPr>
       <w:tblStyleRowBandSize w:val="1"/>
@@ -12394,7 +12686,7 @@
       <w:spacing w:after="0" w:line="240" w:lineRule="auto"/>
     </w:pPr>
     <w:rPr>
-      <w:color w:val="000000" w:themeColor="text1"/>
+      <w:color w:val="000000"/>
     </w:rPr>
     <w:tblPr>
       <w:tblStyleRowBandSize w:val="1"/>

</xml_diff>